<commit_message>
fix(central-sac): remove imagens de exemplo do template RNC
Co-Authored-By: Claude Sonnet 5 <noreply@anthropic.com>
</commit_message>
<xml_diff>
--- a/public/templates/rnc-template.docx
+++ b/public/templates/rnc-template.docx
@@ -1123,155 +1123,6 @@
                 <w:szCs w:val="20"/>
               </w:rPr>
             </w:pPr>
-            <w:r>
-              <w:rPr>
-                <w:noProof/>
-              </w:rPr>
-              <w:drawing>
-                <wp:inline distT="0" distB="0" distL="0" distR="0" wp14:anchorId="7ACDC821" wp14:editId="64C8AEC0">
-                  <wp:extent cx="1929600" cy="2570400"/>
-                  <wp:effectExtent l="0" t="0" r="0" b="1905"/>
-                  <wp:docPr id="2145665474" name="Imagem 1"/>
-                  <wp:cNvGraphicFramePr>
-                    <a:graphicFrameLocks xmlns:a="http://schemas.openxmlformats.org/drawingml/2006/main" noChangeAspect="1"/>
-                  </wp:cNvGraphicFramePr>
-                  <a:graphic xmlns:a="http://schemas.openxmlformats.org/drawingml/2006/main">
-                    <a:graphicData uri="http://schemas.openxmlformats.org/drawingml/2006/picture">
-                      <pic:pic xmlns:pic="http://schemas.openxmlformats.org/drawingml/2006/picture">
-                        <pic:nvPicPr>
-                          <pic:cNvPr id="0" name="Picture 1"/>
-                          <pic:cNvPicPr>
-                            <a:picLocks noChangeAspect="1" noChangeArrowheads="1"/>
-                          </pic:cNvPicPr>
-                        </pic:nvPicPr>
-                        <pic:blipFill>
-                          <a:blip r:embed="rId12" r:link="rId13" cstate="print">
-                            <a:extLst>
-                              <a:ext uri="{28A0092B-C50C-407E-A947-70E740481C1C}">
-                                <a14:useLocalDpi xmlns:a14="http://schemas.microsoft.com/office/drawing/2010/main" val="0"/>
-                              </a:ext>
-                            </a:extLst>
-                          </a:blip>
-                          <a:srcRect/>
-                          <a:stretch>
-                            <a:fillRect/>
-                          </a:stretch>
-                        </pic:blipFill>
-                        <pic:spPr bwMode="auto">
-                          <a:xfrm>
-                            <a:off x="0" y="0"/>
-                            <a:ext cx="1929600" cy="2570400"/>
-                          </a:xfrm>
-                          <a:prstGeom prst="rect">
-                            <a:avLst/>
-                          </a:prstGeom>
-                          <a:noFill/>
-                          <a:ln>
-                            <a:noFill/>
-                          </a:ln>
-                        </pic:spPr>
-                      </pic:pic>
-                    </a:graphicData>
-                  </a:graphic>
-                </wp:inline>
-              </w:drawing>
-              <w:drawing>
-                <wp:inline distT="0" distB="0" distL="0" distR="0" wp14:anchorId="2A03F05D" wp14:editId="1B068929">
-                  <wp:extent cx="1929600" cy="2570400"/>
-                  <wp:effectExtent l="0" t="0" r="0" b="1905"/>
-                  <wp:docPr id="1701126299" name="Imagem 2"/>
-                  <wp:cNvGraphicFramePr>
-                    <a:graphicFrameLocks xmlns:a="http://schemas.openxmlformats.org/drawingml/2006/main" noChangeAspect="1"/>
-                  </wp:cNvGraphicFramePr>
-                  <a:graphic xmlns:a="http://schemas.openxmlformats.org/drawingml/2006/main">
-                    <a:graphicData uri="http://schemas.openxmlformats.org/drawingml/2006/picture">
-                      <pic:pic xmlns:pic="http://schemas.openxmlformats.org/drawingml/2006/picture">
-                        <pic:nvPicPr>
-                          <pic:cNvPr id="0" name="Picture 3"/>
-                          <pic:cNvPicPr>
-                            <a:picLocks noChangeAspect="1" noChangeArrowheads="1"/>
-                          </pic:cNvPicPr>
-                        </pic:nvPicPr>
-                        <pic:blipFill>
-                          <a:blip r:embed="rId14" r:link="rId15" cstate="print">
-                            <a:extLst>
-                              <a:ext uri="{28A0092B-C50C-407E-A947-70E740481C1C}">
-                                <a14:useLocalDpi xmlns:a14="http://schemas.microsoft.com/office/drawing/2010/main" val="0"/>
-                              </a:ext>
-                            </a:extLst>
-                          </a:blip>
-                          <a:srcRect/>
-                          <a:stretch>
-                            <a:fillRect/>
-                          </a:stretch>
-                        </pic:blipFill>
-                        <pic:spPr bwMode="auto">
-                          <a:xfrm>
-                            <a:off x="0" y="0"/>
-                            <a:ext cx="1929600" cy="2570400"/>
-                          </a:xfrm>
-                          <a:prstGeom prst="rect">
-                            <a:avLst/>
-                          </a:prstGeom>
-                          <a:noFill/>
-                          <a:ln>
-                            <a:noFill/>
-                          </a:ln>
-                        </pic:spPr>
-                      </pic:pic>
-                    </a:graphicData>
-                  </a:graphic>
-                </wp:inline>
-              </w:drawing>
-              <w:drawing>
-                <wp:inline distT="0" distB="0" distL="0" distR="0" wp14:anchorId="32550499" wp14:editId="365CA3D9">
-                  <wp:extent cx="1929600" cy="2570400"/>
-                  <wp:effectExtent l="0" t="0" r="0" b="1905"/>
-                  <wp:docPr id="2043872517" name="Imagem 3"/>
-                  <wp:cNvGraphicFramePr>
-                    <a:graphicFrameLocks xmlns:a="http://schemas.openxmlformats.org/drawingml/2006/main" noChangeAspect="1"/>
-                  </wp:cNvGraphicFramePr>
-                  <a:graphic xmlns:a="http://schemas.openxmlformats.org/drawingml/2006/main">
-                    <a:graphicData uri="http://schemas.openxmlformats.org/drawingml/2006/picture">
-                      <pic:pic xmlns:pic="http://schemas.openxmlformats.org/drawingml/2006/picture">
-                        <pic:nvPicPr>
-                          <pic:cNvPr id="0" name="Picture 5"/>
-                          <pic:cNvPicPr>
-                            <a:picLocks noChangeAspect="1" noChangeArrowheads="1"/>
-                          </pic:cNvPicPr>
-                        </pic:nvPicPr>
-                        <pic:blipFill>
-                          <a:blip r:embed="rId16" r:link="rId17" cstate="print">
-                            <a:extLst>
-                              <a:ext uri="{28A0092B-C50C-407E-A947-70E740481C1C}">
-                                <a14:useLocalDpi xmlns:a14="http://schemas.microsoft.com/office/drawing/2010/main" val="0"/>
-                              </a:ext>
-                            </a:extLst>
-                          </a:blip>
-                          <a:srcRect/>
-                          <a:stretch>
-                            <a:fillRect/>
-                          </a:stretch>
-                        </pic:blipFill>
-                        <pic:spPr bwMode="auto">
-                          <a:xfrm>
-                            <a:off x="0" y="0"/>
-                            <a:ext cx="1929600" cy="2570400"/>
-                          </a:xfrm>
-                          <a:prstGeom prst="rect">
-                            <a:avLst/>
-                          </a:prstGeom>
-                          <a:noFill/>
-                          <a:ln>
-                            <a:noFill/>
-                          </a:ln>
-                        </pic:spPr>
-                      </pic:pic>
-                    </a:graphicData>
-                  </a:graphic>
-                </wp:inline>
-              </w:drawing>
-            </w:r>
           </w:p>
           <w:p>
             <w:pPr>
@@ -1283,60 +1134,6 @@
                 <w:szCs w:val="20"/>
               </w:rPr>
             </w:pPr>
-            <w:r>
-              <w:rPr>
-                <w:noProof/>
-              </w:rPr>
-              <w:lastRenderedPageBreak/>
-              <w:drawing>
-                <wp:inline distT="0" distB="0" distL="0" distR="0" wp14:anchorId="160E1C8F" wp14:editId="3F0177C5">
-                  <wp:extent cx="1929600" cy="2570400"/>
-                  <wp:effectExtent l="0" t="0" r="0" b="1905"/>
-                  <wp:docPr id="1805695906" name="Imagem 5"/>
-                  <wp:cNvGraphicFramePr>
-                    <a:graphicFrameLocks xmlns:a="http://schemas.openxmlformats.org/drawingml/2006/main" noChangeAspect="1"/>
-                  </wp:cNvGraphicFramePr>
-                  <a:graphic xmlns:a="http://schemas.openxmlformats.org/drawingml/2006/main">
-                    <a:graphicData uri="http://schemas.openxmlformats.org/drawingml/2006/picture">
-                      <pic:pic xmlns:pic="http://schemas.openxmlformats.org/drawingml/2006/picture">
-                        <pic:nvPicPr>
-                          <pic:cNvPr id="0" name="Picture 9"/>
-                          <pic:cNvPicPr>
-                            <a:picLocks noChangeAspect="1" noChangeArrowheads="1"/>
-                          </pic:cNvPicPr>
-                        </pic:nvPicPr>
-                        <pic:blipFill>
-                          <a:blip r:embed="rId18" r:link="rId19" cstate="print">
-                            <a:extLst>
-                              <a:ext uri="{28A0092B-C50C-407E-A947-70E740481C1C}">
-                                <a14:useLocalDpi xmlns:a14="http://schemas.microsoft.com/office/drawing/2010/main" val="0"/>
-                              </a:ext>
-                            </a:extLst>
-                          </a:blip>
-                          <a:srcRect/>
-                          <a:stretch>
-                            <a:fillRect/>
-                          </a:stretch>
-                        </pic:blipFill>
-                        <pic:spPr bwMode="auto">
-                          <a:xfrm>
-                            <a:off x="0" y="0"/>
-                            <a:ext cx="1929600" cy="2570400"/>
-                          </a:xfrm>
-                          <a:prstGeom prst="rect">
-                            <a:avLst/>
-                          </a:prstGeom>
-                          <a:noFill/>
-                          <a:ln>
-                            <a:noFill/>
-                          </a:ln>
-                        </pic:spPr>
-                      </pic:pic>
-                    </a:graphicData>
-                  </a:graphic>
-                </wp:inline>
-              </w:drawing>
-            </w:r>
           </w:p>
           <w:p>
             <w:pPr>
@@ -1949,55 +1746,6 @@
               <w:lastRenderedPageBreak/>
               <w:t/>
             </w:r>
-            <w:r>
-              <w:rPr>
-                <w:rFonts w:ascii="Roboto" w:eastAsia="Roboto" w:hAnsi="Roboto" w:cs="Roboto"/>
-                <w:noProof/>
-                <w:sz w:val="20"/>
-                <w:szCs w:val="20"/>
-              </w:rPr>
-              <w:drawing>
-                <wp:inline distT="0" distB="0" distL="0" distR="0" wp14:anchorId="2F9D61FB" wp14:editId="7C677426">
-                  <wp:extent cx="2700000" cy="3600000"/>
-                  <wp:effectExtent l="0" t="0" r="5715" b="635"/>
-                  <wp:docPr id="881343182" name="Imagem 1" descr="Caixa de salgadinho&#10;&#10;Descrição gerada automaticamente"/>
-                  <wp:cNvGraphicFramePr>
-                    <a:graphicFrameLocks xmlns:a="http://schemas.openxmlformats.org/drawingml/2006/main" noChangeAspect="1"/>
-                  </wp:cNvGraphicFramePr>
-                  <a:graphic xmlns:a="http://schemas.openxmlformats.org/drawingml/2006/main">
-                    <a:graphicData uri="http://schemas.openxmlformats.org/drawingml/2006/picture">
-                      <pic:pic xmlns:pic="http://schemas.openxmlformats.org/drawingml/2006/picture">
-                        <pic:nvPicPr>
-                          <pic:cNvPr id="881343182" name="Imagem 1" descr="Caixa de salgadinho&#10;&#10;Descrição gerada automaticamente"/>
-                          <pic:cNvPicPr/>
-                        </pic:nvPicPr>
-                        <pic:blipFill>
-                          <a:blip r:embed="rId20" cstate="print">
-                            <a:extLst>
-                              <a:ext uri="{28A0092B-C50C-407E-A947-70E740481C1C}">
-                                <a14:useLocalDpi xmlns:a14="http://schemas.microsoft.com/office/drawing/2010/main" val="0"/>
-                              </a:ext>
-                            </a:extLst>
-                          </a:blip>
-                          <a:stretch>
-                            <a:fillRect/>
-                          </a:stretch>
-                        </pic:blipFill>
-                        <pic:spPr>
-                          <a:xfrm>
-                            <a:off x="0" y="0"/>
-                            <a:ext cx="2700000" cy="3600000"/>
-                          </a:xfrm>
-                          <a:prstGeom prst="rect">
-                            <a:avLst/>
-                          </a:prstGeom>
-                        </pic:spPr>
-                      </pic:pic>
-                    </a:graphicData>
-                  </a:graphic>
-                </wp:inline>
-              </w:drawing>
-            </w:r>
           </w:p>
           <w:p>
             <w:pPr>
@@ -2401,57 +2149,6 @@
       <w:pPr>
         <w:jc w:val="center"/>
       </w:pPr>
-      <w:r>
-        <w:rPr>
-          <w:noProof/>
-        </w:rPr>
-        <w:lastRenderedPageBreak/>
-        <w:drawing>
-          <wp:inline distT="0" distB="0" distL="0" distR="0" wp14:anchorId="3E120F75" wp14:editId="75FAE50F">
-            <wp:extent cx="2095500" cy="1153954"/>
-            <wp:effectExtent l="152400" t="152400" r="361950" b="370205"/>
-            <wp:docPr id="692583893" name="Imagem 1" descr="Tela de celular com publicação numa rede social&#10;&#10;O conteúdo gerado por IA pode estar incorreto."/>
-            <wp:cNvGraphicFramePr>
-              <a:graphicFrameLocks xmlns:a="http://schemas.openxmlformats.org/drawingml/2006/main" noChangeAspect="1"/>
-            </wp:cNvGraphicFramePr>
-            <a:graphic xmlns:a="http://schemas.openxmlformats.org/drawingml/2006/main">
-              <a:graphicData uri="http://schemas.openxmlformats.org/drawingml/2006/picture">
-                <pic:pic xmlns:pic="http://schemas.openxmlformats.org/drawingml/2006/picture">
-                  <pic:nvPicPr>
-                    <pic:cNvPr id="692583893" name="Imagem 1" descr="Tela de celular com publicação numa rede social&#10;&#10;O conteúdo gerado por IA pode estar incorreto."/>
-                    <pic:cNvPicPr/>
-                  </pic:nvPicPr>
-                  <pic:blipFill>
-                    <a:blip r:embed="rId21"/>
-                    <a:stretch>
-                      <a:fillRect/>
-                    </a:stretch>
-                  </pic:blipFill>
-                  <pic:spPr>
-                    <a:xfrm>
-                      <a:off x="0" y="0"/>
-                      <a:ext cx="2114781" cy="1164571"/>
-                    </a:xfrm>
-                    <a:prstGeom prst="rect">
-                      <a:avLst/>
-                    </a:prstGeom>
-                    <a:ln>
-                      <a:noFill/>
-                    </a:ln>
-                    <a:effectLst>
-                      <a:outerShdw blurRad="292100" dist="139700" dir="2700000" algn="tl" rotWithShape="0">
-                        <a:srgbClr val="333333">
-                          <a:alpha val="65000"/>
-                        </a:srgbClr>
-                      </a:outerShdw>
-                    </a:effectLst>
-                  </pic:spPr>
-                </pic:pic>
-              </a:graphicData>
-            </a:graphic>
-          </wp:inline>
-        </w:drawing>
-      </w:r>
     </w:p>
     <w:sectPr>
       <w:headerReference w:type="default" r:id="rId22"/>

</xml_diff>